<commit_message>
Update to test one
this adds test two comment
</commit_message>
<xml_diff>
--- a/Test Doc.docx
+++ b/Test Doc.docx
@@ -14,7 +14,11 @@
         <w:t xml:space="preserve">This is test one </w:t>
       </w:r>
     </w:p>
-    <w:p/>
+    <w:p>
+      <w:r>
+        <w:t>This is Test two corrected from the original pushing to github</w:t>
+      </w:r>
+    </w:p>
     <w:p>
       <w:r>
         <w:t xml:space="preserve">This is test three </w:t>
@@ -23,31 +27,7 @@
     <w:p/>
     <w:p>
       <w:r>
-        <w:t xml:space="preserve">The revision should </w:t>
-      </w:r>
-      <w:proofErr w:type="gramStart"/>
-      <w:r>
-        <w:t>correct</w:t>
-      </w:r>
-      <w:proofErr w:type="gramEnd"/>
-      <w:r>
-        <w:t xml:space="preserve"> </w:t>
-      </w:r>
-      <w:proofErr w:type="gramStart"/>
-      <w:r>
-        <w:t>and</w:t>
-      </w:r>
-      <w:proofErr w:type="gramEnd"/>
-      <w:r>
-        <w:t xml:space="preserve"> addition to test two and </w:t>
-      </w:r>
-      <w:proofErr w:type="gramStart"/>
-      <w:r>
-        <w:t>merge</w:t>
-      </w:r>
-      <w:proofErr w:type="gramEnd"/>
-      <w:r>
-        <w:t xml:space="preserve"> </w:t>
+        <w:t xml:space="preserve">The revision should correct and addition to test two and merge </w:t>
       </w:r>
     </w:p>
     <w:p/>

</xml_diff>